<commit_message>
feat(gdp_tempo): prepare manuscript for JEDC submission
- Update title: 'Drifting Time-to-Build and the Forgotten Intangible Share'
- Update AI declaration to Elsevier format
- Create cover letters addressed to JEDC editors
- Add highlights.txt (5 bullets, each <=85 chars)
- Rebuild all docx/pptx outputs
- Include Fig 5/7 visual fixes from PR #100

Co-Authored-By: Tatsuki Onishi <bougtoir@gmail.com>
</commit_message>
<xml_diff>
--- a/gdp_tempo_paper/cover_letter/cover_letter_en.docx
+++ b/gdp_tempo_paper/cover_letter/cover_letter_en.docx
@@ -68,7 +68,7 @@
         <w:spacing w:line="360" w:lineRule="auto"/>
       </w:pPr>
       <w:r>
-        <w:t>8 May 2026</w:t>
+        <w:t>19 May 2026</w:t>
       </w:r>
     </w:p>
     <w:p>
@@ -81,7 +81,7 @@
         <w:spacing w:line="360" w:lineRule="auto"/>
       </w:pPr>
       <w:r>
-        <w:t>The Editor-in-Chief</w:t>
+        <w:t>The Editors</w:t>
       </w:r>
     </w:p>
     <w:p>
@@ -92,15 +92,7 @@
         <w:rPr>
           <w:i/>
         </w:rPr>
-        <w:t>Review of Income and Wealth</w:t>
-      </w:r>
-    </w:p>
-    <w:p>
-      <w:pPr>
-        <w:spacing w:line="360" w:lineRule="auto"/>
-      </w:pPr>
-      <w:r>
-        <w:t>International Association for Research in Income and Wealth (IARIW)</w:t>
+        <w:t>Journal of Economic Dynamics and Control</w:t>
       </w:r>
     </w:p>
     <w:p>
@@ -113,7 +105,7 @@
         <w:spacing w:line="360" w:lineRule="auto"/>
       </w:pPr>
       <w:r>
-        <w:t>Dear Editor-in-Chief,</w:t>
+        <w:t>Dear Editors,</w:t>
       </w:r>
     </w:p>
     <w:p>
@@ -132,16 +124,16 @@
         <w:rPr>
           <w:b/>
         </w:rPr>
-        <w:t>"The Forgotten Tempo Effect in Capital Accounting: Investment-to-Output Time-to-Build, Intangible Capital, and the Reconciliation of Flow- and Stock-Based National Wealth Measures"</w:t>
+        <w:t>"Drifting Time-to-Build and the Forgotten Intangible Share: A Joint Identification of Flow and Stock National Accounts"</w:t>
       </w:r>
       <w:r>
-        <w:t xml:space="preserve">, as a Research Article for </w:t>
+        <w:t xml:space="preserve">, as an Article for the </w:t>
       </w:r>
       <w:r>
         <w:rPr>
           <w:i/>
         </w:rPr>
-        <w:t>Review of Income and Wealth</w:t>
+        <w:t>Journal of Economic Dynamics and Control</w:t>
       </w:r>
       <w:r>
         <w:t>.</w:t>
@@ -157,7 +149,7 @@
         <w:spacing w:line="360" w:lineRule="auto"/>
       </w:pPr>
       <w:r>
-        <w:t>The paper ports the Bongaarts–Feeney–Goldstein–Lutz–Scherbov quantum–tempo decomposition from formal demography to capital accounting. National income and wealth measurement has long lived with two unresolved tensions — a flow side (GDP) that ignores depreciation and intangible assets, and a stock side (Inclusive Wealth, SEEA, the World Bank's Changing Wealth of Nations) that is internally inconsistent and rarely lines up with independently reconstructed capital stocks. I argue that this is not a deep ontological problem but a measurement problem of exactly the form demographers solved twenty years ago: there is a tempo bias in how investment maps into output (a time-varying time-to-build μ(t)), and there is a "forgotten" parameter (the intangible-capital share β) that plays the same balance-sheet role as Goldstein, Lutz, and Scherbov's σ.</w:t>
+        <w:t>The paper ports the Bongaarts–Feeney–Goldstein–Lutz–Scherbov quantum–tempo decomposition from formal demography to capital accounting. I argue that a long-standing tension between flow-based (GDP) and stock-based (CWON, IWI, SEEA) national wealth measures is not a deep ontological problem but a measurement problem of exactly the form demographers solved two decades ago: there is a tempo bias in how investment maps into output (a time-varying time-to-build μ(t)), and there is a "forgotten" parameter (the intangible-capital share β) that plays the same balance-sheet role as Goldstein, Lutz, and Scherbov's parity-specific variance σ.</w:t>
       </w:r>
     </w:p>
     <w:p>
@@ -170,7 +162,7 @@
         <w:spacing w:line="360" w:lineRule="auto"/>
       </w:pPr>
       <w:r>
-        <w:t>The empirical contribution is fourfold. (i) Across 39 OECD and middle-income economies (Penn World Table 10.01, World Bank Changing Wealth of Nations), allowing μ to drift over time reduces the median out-of-sample MAPE of GDP levels on a 2015–2019 holdout from 4.60 % to 3.99 % — a 13 % relative improvement obtained without any new data, any new stochastic machinery, or any loss of single-equation tractability. (ii) A joint production-and-wealth identification rejects μ = 0 for 35/39 countries and β = 0 for 28/39, with bootstrap 95 % regions whose shape varies systematically with R&amp;D intensity. (iii) The same hidden parameters reconcile a within-country trajectory RMSE of 0.049 log units between perpetual-inventory and CWON wealth aggregates. (iv) The Japan PIM–CWON gap, which has been an embarrassment to flow-stock reconciliation for a decade, closes under a γ_price ≈ +0.02 / year revaluation drift consistent with land-price deflation — a fifth hidden parameter that the framework makes explicit rather than absorbing into a residual.</w:t>
+        <w:t>The empirical contribution has six components. (i) Across 39 OECD and middle-income economies (Penn World Table 10.01, World Bank Changing Wealth of Nations), allowing μ to drift over time reduces the median out-of-sample MAPE of GDP levels on a 2015–2019 holdout from 4.60 % to 3.99 % — a 13 % relative improvement obtained without any new data or stochastic machinery. (ii) A joint production-and-wealth identification rejects μ = 0 for 35/39 countries and β = 0 for 28/39, with bootstrap 95 % regions whose shape varies systematically with R&amp;D intensity. (iii) A Relational PIM diagnostic — transplanting the Brass relational model from demography — shows that the tempo and intangible corrections move the PIM–CWON consistency parameter ρ̂₂ toward unity (median 0.801 → 0.833). (iv) Conditional out-of-sample evaluation restricted to the 14 countries with interior-solution μ̂ reveals that the full-sample MAPE comparison conflates countries for which the tempo correction is genuinely informative with those for which it is mechanically zero: among interior-solution countries, M1 achieves 4.23 % vs M0's 4.27 %. (v) An extended metric — CWON trajectory RMSE on the hold-out years — shows M2 (tempo drift) achieves 15 % lower trajectory error than M0 (0.0072 vs 0.0085), capturing a dimension of model performance that level MAPE misses. (vi) A cross-sectional regression of ρ̂₂ on R&amp;D intensity yields a significant slope under M4 (t = 2.34, R² = 0.129), confirming that the corrections are most effective for innovation-oriented economies.</w:t>
       </w:r>
     </w:p>
     <w:p>
@@ -183,16 +175,16 @@
         <w:spacing w:line="360" w:lineRule="auto"/>
       </w:pPr>
       <w:r>
-        <w:t xml:space="preserve">I believe this work will interest the readership of </w:t>
+        <w:t xml:space="preserve">I believe this work is well suited to the </w:t>
       </w:r>
       <w:r>
         <w:rPr>
           <w:i/>
         </w:rPr>
-        <w:t>Review of Income and Wealth</w:t>
+        <w:t>Journal of Economic Dynamics and Control</w:t>
       </w:r>
       <w:r>
-        <w:t xml:space="preserve"> for three reasons. First, the journal has been the primary venue for the Corrado–Hulten–Sichel intangible-capital programme and for IARIW work on wealth accounting; this paper unifies the two sides of that programme inside a single identification framework. Second, the methodology is methodologically cheap and conceptually symmetric with a well-understood demographic precedent, which we hope will make it teachable. Third, the policy implication is direct: Beyond-GDP indices should be audited for internal flow-stock consistency before they are aggregated into composite welfare measures, because the same hidden parameters that distort GDP also distort wealth.</w:t>
+        <w:t xml:space="preserve"> for the following reasons. First, the paper develops a dynamic structural model of time-varying time-to-build — the central "time to build" concept that Kydland and Prescott (1982) introduced but that has never been allowed to drift over time. Kaboski (2005), published in JEDC, documented cross-industry heterogeneity in investment lags; our paper extends this into a time-varying framework with joint flow-stock identification. Second, the paper contributes computational methods — a joint identification algorithm that simultaneously estimates production-function parameters against both national-income flow data and national-wealth stock data — which aligns directly with the journal's scope in computational methods for economics. Third, the policy implications for Beyond-GDP measurement, intangible capital accounting, and the reinterpretation of the Solow residual have broad relevance to macroeconomic dynamics and control.</w:t>
       </w:r>
     </w:p>
     <w:p>
@@ -205,7 +197,7 @@
         <w:spacing w:line="360" w:lineRule="auto"/>
       </w:pPr>
       <w:r>
-        <w:t>The manuscript is approximately 7,000 words of body text, with five figures, two tables, and full references in author-date style following the IARIW stylesheet I was able to locate. A bilingual (Japanese / English) version of the body is maintained in the public companion repository, but only the English version is submitted for review.</w:t>
+        <w:t>The manuscript is approximately 8,500 words of body text, with nine figures, four tables, and references in author-date style. Submission is via Editorial Manager at editorialmanager.com/jedc.</w:t>
       </w:r>
     </w:p>
     <w:p>
@@ -250,7 +242,7 @@
         <w:spacing w:line="360" w:lineRule="auto"/>
       </w:pPr>
       <w:r>
-        <w:t>All data sources used (Penn World Table 10.01; World Bank Changing Wealth of Nations) are publicly available; analysis code, intermediate outputs, and figure-generation scripts are archived in the public companion repository.</w:t>
+        <w:t>All data sources used (Penn World Table 10.01; World Bank Changing Wealth of Nations; World Bank WDI) are publicly available; analysis code, intermediate outputs, and figure-generation scripts are archived in the public companion repository.</w:t>
       </w:r>
     </w:p>
     <w:p>
@@ -277,7 +269,7 @@
         <w:spacing w:line="360" w:lineRule="auto"/>
       </w:pPr>
       <w:r>
-        <w:t>I used generative AI to help with formatting the text and choosing words that suited the tone, and to help writing codes; this is declared on the title page in accordance with current journal policy.</w:t>
+        <w:t>I used generative AI to assist with formatting the text, choosing words that suited the tone, and writing analysis code; this is declared on the title page following Elsevier's generative AI policy.</w:t>
       </w:r>
     </w:p>
     <w:p>
@@ -286,7 +278,7 @@
         <w:spacing w:line="360" w:lineRule="auto"/>
       </w:pPr>
       <w:r>
-        <w:t>A sister paper applying the same tempo + hidden-parameter framework to sustainable healthcare spending is in preparation; that manuscript will be submitted separately and is referenced as forthcoming work in the present manuscript's Section 6.4.</w:t>
+        <w:t>A companion paper applying the same tempo + hidden-parameter framework to health expenditure is in preparation and is referenced as forthcoming work in Section 6.4.</w:t>
       </w:r>
     </w:p>
     <w:p>
@@ -299,7 +291,7 @@
         <w:spacing w:line="360" w:lineRule="auto"/>
       </w:pPr>
       <w:r>
-        <w:t>I would be grateful for your consideration. Suggested reviewers can be provided if desired.</w:t>
+        <w:t>I would be grateful for your consideration. Suggested reviewers can be provided upon request.</w:t>
       </w:r>
     </w:p>
     <w:p>

</xml_diff>

<commit_message>
feat(gdp_tempo): Empirical Economics投稿準備 — Springer形式・カバーレター・Abstract拡張
Changes from JEDC (Elsevier) to Empirical Economics (Springer):
- Title page: Springer 'Statements and Declarations' format
  (competing interests, funding, data availability, AI tools)
- Running head and CRediT removed (not required by Springer)
- Highlights removed (not required by Springer)
- Abstract expanded 146→168 words (EE requires 150-250)
  Added: grid-search joint identification, bootstrap, RPIM diagnostic
- Keywords updated: bootstrap inference, out-of-sample prediction
- JEL codes: added C13 (Estimation: General)
- Cover letters rewritten for EE (EN + JA)
- AI declaration: moved to Methods-style in 'Statements and Declarations'
- build_docx_pptx.py docstring updated for EE

Co-Authored-By: Tatsuki Onishi <bougtoir@gmail.com>
</commit_message>
<xml_diff>
--- a/gdp_tempo_paper/cover_letter/cover_letter_en.docx
+++ b/gdp_tempo_paper/cover_letter/cover_letter_en.docx
@@ -81,7 +81,7 @@
         <w:spacing w:line="360" w:lineRule="auto"/>
       </w:pPr>
       <w:r>
-        <w:t>The Editors</w:t>
+        <w:t>The Coordinating Editor</w:t>
       </w:r>
     </w:p>
     <w:p>
@@ -92,7 +92,7 @@
         <w:rPr>
           <w:i/>
         </w:rPr>
-        <w:t>Journal of Economic Dynamics and Control</w:t>
+        <w:t>Empirical Economics</w:t>
       </w:r>
     </w:p>
     <w:p>
@@ -105,7 +105,7 @@
         <w:spacing w:line="360" w:lineRule="auto"/>
       </w:pPr>
       <w:r>
-        <w:t>Dear Editors,</w:t>
+        <w:t>Dear Editor,</w:t>
       </w:r>
     </w:p>
     <w:p>
@@ -127,13 +127,13 @@
         <w:t>"Drifting Time-to-Build and the Forgotten Intangible Share: A Joint Identification of Flow and Stock National Accounts"</w:t>
       </w:r>
       <w:r>
-        <w:t xml:space="preserve">, as an Article for the </w:t>
+        <w:t xml:space="preserve">, as an Article for </w:t>
       </w:r>
       <w:r>
         <w:rPr>
           <w:i/>
         </w:rPr>
-        <w:t>Journal of Economic Dynamics and Control</w:t>
+        <w:t>Empirical Economics</w:t>
       </w:r>
       <w:r>
         <w:t>.</w:t>
@@ -149,7 +149,7 @@
         <w:spacing w:line="360" w:lineRule="auto"/>
       </w:pPr>
       <w:r>
-        <w:t>The paper ports the Bongaarts–Feeney–Goldstein–Lutz–Scherbov quantum–tempo decomposition from formal demography to capital accounting. I argue that a long-standing tension between flow-based (GDP) and stock-based (CWON, IWI, SEEA) national wealth measures is not a deep ontological problem but a measurement problem of exactly the form demographers solved two decades ago: there is a tempo bias in how investment maps into output (a time-varying time-to-build μ(t)), and there is a "forgotten" parameter (the intangible-capital share β) that plays the same balance-sheet role as Goldstein, Lutz, and Scherbov's parity-specific variance σ.</w:t>
+        <w:t>The paper applies a joint identification framework to estimate two latent parameters — a time-varying investment-to-output lag μ(t) and an intangible-capital share β — using both national-income flow data (Penn World Table 10.01) and national-wealth stock data (World Bank Changing Wealth of Nations) across 39 OECD and middle-income economies. The identification strategy, based on grid search over non-convex objective surfaces with residual bootstrap inference, exploits the information content of both the production side and the wealth side to pin down structural parameters that neither data source alone can identify.</w:t>
       </w:r>
     </w:p>
     <w:p>
@@ -162,7 +162,7 @@
         <w:spacing w:line="360" w:lineRule="auto"/>
       </w:pPr>
       <w:r>
-        <w:t>The empirical contribution has six components. (i) Across 39 OECD and middle-income economies (Penn World Table 10.01, World Bank Changing Wealth of Nations), allowing μ to drift over time reduces the median out-of-sample MAPE of GDP levels on a 2015–2019 holdout from 4.60 % to 3.99 % — a 13 % relative improvement obtained without any new data or stochastic machinery. (ii) A joint production-and-wealth identification rejects μ = 0 for 35/39 countries and β = 0 for 28/39, with bootstrap 95 % regions whose shape varies systematically with R&amp;D intensity. (iii) A Relational PIM diagnostic — transplanting the Brass relational model from demography — shows that the tempo and intangible corrections move the PIM–CWON consistency parameter ρ̂₂ toward unity (median 0.801 → 0.833). (iv) Conditional out-of-sample evaluation restricted to the 14 countries with interior-solution μ̂ reveals that the full-sample MAPE comparison conflates countries for which the tempo correction is genuinely informative with those for which it is mechanically zero: among interior-solution countries, M1 achieves 4.23 % vs M0's 4.27 %. (v) An extended metric — CWON trajectory RMSE on the hold-out years — shows M2 (tempo drift) achieves 15 % lower trajectory error than M0 (0.0072 vs 0.0085), capturing a dimension of model performance that level MAPE misses. (vi) A cross-sectional regression of ρ̂₂ on R&amp;D intensity yields a significant slope under M4 (t = 2.34, R² = 0.129), confirming that the corrections are most effective for innovation-oriented economies.</w:t>
+        <w:t>The empirical results include: (i) a time-varying μ(t) reduces the median out-of-sample MAPE of GDP levels on a 2015–2019 holdout from 4.60% to 3.99% — a 13% relative improvement; (ii) joint identification rejects μ = 0 for 35/39 countries and β = 0 for 28/39, with bootstrap 95% intervals whose shape varies systematically with R&amp;D intensity; (iii) a novel Relational PIM diagnostic — transplanting the Brass relational model from demography — shows that the corrections move the PIM–CWON consistency parameter ρ̂₂ toward unity (median 0.801 → 0.833); (iv) a CWON trajectory RMSE metric on the holdout reveals a 15% improvement under tempo drift (M2) relative to the Solow baseline, capturing model performance along a dimension that GDP-level MAPE misses.</w:t>
       </w:r>
     </w:p>
     <w:p>
@@ -175,16 +175,16 @@
         <w:spacing w:line="360" w:lineRule="auto"/>
       </w:pPr>
       <w:r>
-        <w:t xml:space="preserve">I believe this work is well suited to the </w:t>
+        <w:t xml:space="preserve">I believe this work is well suited to </w:t>
       </w:r>
       <w:r>
         <w:rPr>
           <w:i/>
         </w:rPr>
-        <w:t>Journal of Economic Dynamics and Control</w:t>
+        <w:t>Empirical Economics</w:t>
       </w:r>
       <w:r>
-        <w:t xml:space="preserve"> for the following reasons. First, the paper develops a dynamic structural model of time-varying time-to-build — the central "time to build" concept that Kydland and Prescott (1982) introduced but that has never been allowed to drift over time. Kaboski (2005), published in JEDC, documented cross-industry heterogeneity in investment lags; our paper extends this into a time-varying framework with joint flow-stock identification. Second, the paper contributes computational methods — a joint identification algorithm that simultaneously estimates production-function parameters against both national-income flow data and national-wealth stock data — which aligns directly with the journal's scope in computational methods for economics. Third, the policy implications for Beyond-GDP measurement, intangible capital accounting, and the reinterpretation of the Solow residual have broad relevance to macroeconomic dynamics and control.</w:t>
+        <w:t xml:space="preserve"> for three reasons. First, it applies advanced econometric and statistical methods (grid search on non-convex surfaces, residual bootstrap, joint loss minimisation) to confront economic theory with observed data across a large cross-country panel — directly matching the journal's stated scope. Second, the identification strategy does not require structural assumptions beyond the standard production function and perpetual inventory method, making it replicable across different data vintages and country samples. Third, the Relational PIM diagnostic is a general-purpose empirical tool for assessing flow–stock consistency in any national-accounting context, with potential applications beyond the capital-accounting setting studied here.</w:t>
       </w:r>
     </w:p>
     <w:p>
@@ -197,7 +197,7 @@
         <w:spacing w:line="360" w:lineRule="auto"/>
       </w:pPr>
       <w:r>
-        <w:t>The manuscript is approximately 8,500 words of body text, with nine figures, four tables, and references in author-date style. Submission is via Editorial Manager at editorialmanager.com/jedc.</w:t>
+        <w:t>The manuscript is approximately 8,500 words of body text, with nine figures and four tables.</w:t>
       </w:r>
     </w:p>
     <w:p>
@@ -242,7 +242,7 @@
         <w:spacing w:line="360" w:lineRule="auto"/>
       </w:pPr>
       <w:r>
-        <w:t>All data sources used (Penn World Table 10.01; World Bank Changing Wealth of Nations; World Bank WDI) are publicly available; analysis code, intermediate outputs, and figure-generation scripts are archived in the public companion repository.</w:t>
+        <w:t>All data sources (Penn World Table 10.01; World Bank CWON; World Bank WDI) are publicly available; analysis code and intermediate outputs are archived in the public companion repository.</w:t>
       </w:r>
     </w:p>
     <w:p>
@@ -251,7 +251,7 @@
         <w:spacing w:line="360" w:lineRule="auto"/>
       </w:pPr>
       <w:r>
-        <w:t>I am the sole author; the CRediT contribution statement is included on the title page.</w:t>
+        <w:t>I am the sole author.</w:t>
       </w:r>
     </w:p>
     <w:p>
@@ -260,7 +260,7 @@
         <w:spacing w:line="360" w:lineRule="auto"/>
       </w:pPr>
       <w:r>
-        <w:t>I have no conflicts of interest, financial or otherwise, related to this work.</w:t>
+        <w:t>I have no competing interests, financial or otherwise, related to this work.</w:t>
       </w:r>
     </w:p>
     <w:p>
@@ -269,16 +269,7 @@
         <w:spacing w:line="360" w:lineRule="auto"/>
       </w:pPr>
       <w:r>
-        <w:t>I used generative AI to assist with formatting the text, choosing words that suited the tone, and writing analysis code; this is declared on the title page following Elsevier's generative AI policy.</w:t>
-      </w:r>
-    </w:p>
-    <w:p>
-      <w:pPr>
-        <w:pStyle w:val="ListBullet"/>
-        <w:spacing w:line="360" w:lineRule="auto"/>
-      </w:pPr>
-      <w:r>
-        <w:t>A companion paper applying the same tempo + hidden-parameter framework to health expenditure is in preparation and is referenced as forthcoming work in Section 6.4.</w:t>
+        <w:t>I used generative AI to assist with formatting the text, choosing words, and writing analysis code; this is documented in the manuscript.</w:t>
       </w:r>
     </w:p>
     <w:p>
@@ -291,7 +282,7 @@
         <w:spacing w:line="360" w:lineRule="auto"/>
       </w:pPr>
       <w:r>
-        <w:t>I would be grateful for your consideration. Suggested reviewers can be provided upon request.</w:t>
+        <w:t>I would be grateful for your consideration.</w:t>
       </w:r>
     </w:p>
     <w:p>

</xml_diff>

<commit_message>
Convert manuscript to JEG format: decimal sections, APA 7 refs, strengthen identification
Format changes (Economica → Journal of Economic Growth / Springer):
- Section headings: Roman numerals (II, III.1) → decimal (2, 3.1)
- Cross-references: 'Section III' → 'Sect. 3', Japanese '第 II 節' → '第 2 節'
- References: ALL CAPS surnames → APA 7 title case, 'and' → '&', DOIs added
- build_docx_pptx.py: remove ALL CAPS/CENTER heading format, 2.0→1.5× spacing

Content strengthening (address Economica identification critique):
- New Sect. 6.3 'Identification strategy and credibility' (EN + JA)
  Three sources: wealth-side constraint, cross-country R&D heterogeneity,
  depreciation-sensitivity check. Explicit acknowledgment of calibrated
  decomposition vs causal identification.
- Subsections 6.3→6.4, 6.4→6.5, 6.5→6.6 renumbered accordingly

Cover letter: Economica editors → Oded Galor (JEG), reframed motivation

Co-Authored-By: Tatsuki Onishi <bougtoir@gmail.com>
</commit_message>
<xml_diff>
--- a/gdp_tempo_paper/cover_letter/cover_letter_en.docx
+++ b/gdp_tempo_paper/cover_letter/cover_letter_en.docx
@@ -116,7 +116,7 @@
           <w:i w:val="0"/>
           <w:sz w:val="24"/>
         </w:rPr>
-        <w:t>19 May 2026</w:t>
+        <w:t>11 June 2026</w:t>
       </w:r>
     </w:p>
     <w:p>
@@ -135,7 +135,7 @@
           <w:i w:val="0"/>
           <w:sz w:val="24"/>
         </w:rPr>
-        <w:t>The Editors</w:t>
+        <w:t>The Editor</w:t>
       </w:r>
     </w:p>
     <w:p>
@@ -149,7 +149,7 @@
           <w:i/>
           <w:sz w:val="24"/>
         </w:rPr>
-        <w:t>Economica</w:t>
+        <w:t>Journal of Economic Growth</w:t>
       </w:r>
     </w:p>
     <w:p>
@@ -168,7 +168,7 @@
           <w:i w:val="0"/>
           <w:sz w:val="24"/>
         </w:rPr>
-        <w:t>Dear Professors Besley, den Haan, Ghatak, Ngai, Overman, and Thomas,</w:t>
+        <w:t>Dear Professor Galor,</w:t>
       </w:r>
     </w:p>
     <w:p>
@@ -205,7 +205,7 @@
           <w:i w:val="0"/>
           <w:sz w:val="24"/>
         </w:rPr>
-        <w:t xml:space="preserve">, as an Article for </w:t>
+        <w:t xml:space="preserve">, for publication in the </w:t>
       </w:r>
       <w:r>
         <w:rPr>
@@ -214,7 +214,7 @@
           <w:i/>
           <w:sz w:val="24"/>
         </w:rPr>
-        <w:t>Economica</w:t>
+        <w:t>Journal of Economic Growth</w:t>
       </w:r>
       <w:r>
         <w:rPr>
@@ -315,7 +315,7 @@
           <w:i w:val="0"/>
           <w:sz w:val="24"/>
         </w:rPr>
-        <w:t xml:space="preserve">I believe this work is well suited to </w:t>
+        <w:t xml:space="preserve">I believe this work is well suited to the </w:t>
       </w:r>
       <w:r>
         <w:rPr>
@@ -324,7 +324,7 @@
           <w:i/>
           <w:sz w:val="24"/>
         </w:rPr>
-        <w:t>Economica</w:t>
+        <w:t>Journal of Economic Growth</w:t>
       </w:r>
       <w:r>
         <w:rPr>
@@ -333,7 +333,61 @@
           <w:i w:val="0"/>
           <w:sz w:val="24"/>
         </w:rPr>
-        <w:t xml:space="preserve"> for three reasons. First, it speaks directly to the economic substance of the Solow residual — a topic of central interest in macroeconomics and growth theory since Griliches (1996). The paper is framed not as a measurement exercise but as a discovery about what TFP has been measuring. Second, the identification exploits a structural analogy with the demographic tempo literature (Bongaarts and Feeney, 1998; Goldstein, Lutz, and Scherbov, 2003) that is novel in economics and generates falsifiable predictions. Third, the counterfactual wealth calculations have concrete policy implications for the Beyond-GDP debate, showing that official statistics systematically understate the productive capital base of innovation-intensive economies.</w:t>
+        <w:t xml:space="preserve"> for three reasons. First, it addresses the measurement foundations of long-run growth accounting — specifically, how the Solow residual confounds genuine productivity innovation with book-keeping artefacts arising from mis-timed capital stocks and omitted intangibles. This is a topic of central importance to the growth-accounting tradition that the </w:t>
+      </w:r>
+      <w:r>
+        <w:rPr>
+          <w:rFonts w:ascii="Times New Roman" w:hAnsi="Times New Roman" w:eastAsia="MS Mincho"/>
+          <w:b w:val="0"/>
+          <w:i/>
+          <w:sz w:val="24"/>
+        </w:rPr>
+        <w:t>Journal</w:t>
+      </w:r>
+      <w:r>
+        <w:rPr>
+          <w:rFonts w:ascii="Times New Roman" w:hAnsi="Times New Roman" w:eastAsia="MS Mincho"/>
+          <w:b w:val="0"/>
+          <w:i w:val="0"/>
+          <w:sz w:val="24"/>
+        </w:rPr>
+        <w:t xml:space="preserve"> has advanced since its founding. Second, the identification strategy exploits a structural analogy with the demographic tempo literature (Bongaarts &amp; Feeney, 1998; Goldstein, Lutz, &amp; Scherbov, 2003), generating falsifiable predictions that are confirmed by the data: the joint flow–stock loss function collapses the (</w:t>
+      </w:r>
+      <w:r>
+        <w:rPr>
+          <w:rFonts w:ascii="Times New Roman" w:hAnsi="Times New Roman" w:eastAsia="MS Mincho"/>
+          <w:b w:val="0"/>
+          <w:i/>
+          <w:sz w:val="24"/>
+        </w:rPr>
+        <w:t>μ</w:t>
+      </w:r>
+      <w:r>
+        <w:rPr>
+          <w:rFonts w:ascii="Times New Roman" w:hAnsi="Times New Roman" w:eastAsia="MS Mincho"/>
+          <w:b w:val="0"/>
+          <w:i w:val="0"/>
+          <w:sz w:val="24"/>
+        </w:rPr>
+        <w:t xml:space="preserve">, </w:t>
+      </w:r>
+      <w:r>
+        <w:rPr>
+          <w:rFonts w:ascii="Times New Roman" w:hAnsi="Times New Roman" w:eastAsia="MS Mincho"/>
+          <w:b w:val="0"/>
+          <w:i/>
+          <w:sz w:val="24"/>
+        </w:rPr>
+        <w:t>β</w:t>
+      </w:r>
+      <w:r>
+        <w:rPr>
+          <w:rFonts w:ascii="Times New Roman" w:hAnsi="Times New Roman" w:eastAsia="MS Mincho"/>
+          <w:b w:val="0"/>
+          <w:i w:val="0"/>
+          <w:sz w:val="24"/>
+        </w:rPr>
+        <w:t>) parameter space from a broad ridge to a point for 28 of 39 countries, and the resulting parameter estimates move in the directions predicted by economic theory. Third, the counterfactual wealth calculations have concrete implications for the Beyond-GDP debate, showing that official statistics systematically understate the productive capital base of innovation-intensive economies by 0.3–1.1 %.</w:t>
       </w:r>
     </w:p>
     <w:p>

</xml_diff>

<commit_message>
JoM submission: Introduction強化 + Policy implications具体化 + double-blind format
- Rewrite Introduction for macro audience: emphasize tempo effect novelty
  for fiscal/monetary policy, connect to output gap and DSGE calibration
- Add concrete Section 6.4 policy implications: potential output & fiscal
  rules, monetary-policy transmission lags, SNA statistical-agency practice,
  international GDP comparability
- Double-blind format: separate title page with author info from anonymized
  manuscript body; add Highlights (5 bullets, all ≤85 chars)
- Update cover letter for Journal of Macroeconomics editor
- Build script: handle title-page/manuscript markers, dash-bullet highlights,
  generate title_page_en.docx/pdf
- Add Havranek & Rusnak (2013) reference for monetary transmission lags
- Sync workflow: add JoM branch mapping to gdp-tempo-paper public repo
- Regenerate all outputs: manuscript docx/pdf, figures pptx, tables, cover letter

Co-Authored-By: Tatsuki Onishi <bougtoir@gmail.com>
</commit_message>
<xml_diff>
--- a/gdp_tempo_paper/cover_letter/cover_letter_en.docx
+++ b/gdp_tempo_paper/cover_letter/cover_letter_en.docx
@@ -116,7 +116,7 @@
           <w:i w:val="0"/>
           <w:sz w:val="24"/>
         </w:rPr>
-        <w:t>11 June 2026</w:t>
+        <w:t>17 June 2026</w:t>
       </w:r>
     </w:p>
     <w:p>
@@ -149,7 +149,7 @@
           <w:i/>
           <w:sz w:val="24"/>
         </w:rPr>
-        <w:t>Journal of Economic Growth</w:t>
+        <w:t>Journal of Macroeconomics</w:t>
       </w:r>
     </w:p>
     <w:p>
@@ -168,7 +168,7 @@
           <w:i w:val="0"/>
           <w:sz w:val="24"/>
         </w:rPr>
-        <w:t>Dear Professor Galor,</w:t>
+        <w:t>Dear Editor,</w:t>
       </w:r>
     </w:p>
     <w:p>
@@ -214,7 +214,7 @@
           <w:i/>
           <w:sz w:val="24"/>
         </w:rPr>
-        <w:t>Journal of Economic Growth</w:t>
+        <w:t>Journal of Macroeconomics</w:t>
       </w:r>
       <w:r>
         <w:rPr>
@@ -242,7 +242,7 @@
           <w:i w:val="0"/>
           <w:sz w:val="24"/>
         </w:rPr>
-        <w:t xml:space="preserve">The paper addresses a fundamental question in growth accounting: how much of what we call TFP is a genuine productivity residual, and how much is a book-keeping artefact of mis-timed capital stocks and omitted intangibles? I show that two parameters — a time-varying investment-to-output lag </w:t>
+        <w:t xml:space="preserve">The paper addresses a fundamental question for macroeconomic measurement and policy: how much of what we call TFP is a genuine productivity residual, and how much is a book-keeping artefact of mis-timed capital stocks and omitted intangibles? Two parameters that conventional growth accounting imposes at zero — a time-varying investment-to-output lag </w:t>
       </w:r>
       <w:r>
         <w:rPr>
@@ -296,7 +296,7 @@
           <w:i w:val="0"/>
           <w:sz w:val="24"/>
         </w:rPr>
-        <w:t xml:space="preserve"> drift reduces out-of-sample GDP forecast error by 13 %, and a Solow-residual decomposition reveals that up to 30 % of TFP-growth variance can be re-attributed to tempo drift and missing intangibles rather than genuine innovation. When both corrections are applied, production-side (flow) and wealth-side (stock) national accounts agree to within 1–2 % for most countries — the first empirical success, to my knowledge, of the "unified national-wealth accounting" programme that Stiglitz, Sen, and Fitoussi (2009) called for.</w:t>
+        <w:t xml:space="preserve"> drift reduces out-of-sample GDP forecast error by 13%, and a Solow-residual decomposition reveals that up to 30% of TFP-growth variance can be re-attributed to tempo drift and missing intangibles rather than genuine innovation. When both corrections are applied, production-side (flow) and wealth-side (stock) national accounts agree to within 1–2% for most countries.</w:t>
       </w:r>
     </w:p>
     <w:p>
@@ -315,7 +315,7 @@
           <w:i w:val="0"/>
           <w:sz w:val="24"/>
         </w:rPr>
-        <w:t xml:space="preserve">I believe this work is well suited to the </w:t>
+        <w:t xml:space="preserve">I believe this work falls squarely within the scope of the </w:t>
       </w:r>
       <w:r>
         <w:rPr>
@@ -324,7 +324,7 @@
           <w:i/>
           <w:sz w:val="24"/>
         </w:rPr>
-        <w:t>Journal of Economic Growth</w:t>
+        <w:t>Journal of Macroeconomics</w:t>
       </w:r>
       <w:r>
         <w:rPr>
@@ -333,7 +333,26 @@
           <w:i w:val="0"/>
           <w:sz w:val="24"/>
         </w:rPr>
-        <w:t xml:space="preserve"> for three reasons. First, it addresses the measurement foundations of long-run growth accounting — specifically, how the Solow residual confounds genuine productivity innovation with book-keeping artefacts arising from mis-timed capital stocks and omitted intangibles. This is a topic of central importance to the growth-accounting tradition that the </w:t>
+        <w:t xml:space="preserve"> for three reasons.</w:t>
+      </w:r>
+    </w:p>
+    <w:p>
+      <w:pPr>
+        <w:spacing w:after="0" w:before="0" w:line="360" w:lineRule="auto"/>
+      </w:pPr>
+    </w:p>
+    <w:p>
+      <w:pPr>
+        <w:spacing w:after="40" w:line="360" w:lineRule="auto"/>
+      </w:pPr>
+      <w:r>
+        <w:rPr>
+          <w:rFonts w:ascii="Times New Roman" w:hAnsi="Times New Roman" w:eastAsia="MS Mincho"/>
+          <w:b w:val="0"/>
+          <w:i w:val="0"/>
+          <w:sz w:val="24"/>
+        </w:rPr>
+        <w:t xml:space="preserve">First, the findings have direct implications for macroeconomic policy. Output-gap estimates that feed into fiscal rules (the EU's Stability and Growth Pact, the US CBO's potential-GDP series) are computed from production functions that assume </w:t>
       </w:r>
       <w:r>
         <w:rPr>
@@ -342,7 +361,7 @@
           <w:i/>
           <w:sz w:val="24"/>
         </w:rPr>
-        <w:t>Journal</w:t>
+        <w:t>μ</w:t>
       </w:r>
       <w:r>
         <w:rPr>
@@ -351,7 +370,44 @@
           <w:i w:val="0"/>
           <w:sz w:val="24"/>
         </w:rPr>
-        <w:t xml:space="preserve"> has advanced since its founding. Second, the identification strategy exploits a structural analogy with the demographic tempo literature (Bongaarts &amp; Feeney, 1998; Goldstein, Lutz, &amp; Scherbov, 2003), generating falsifiable predictions that are confirmed by the data: the joint flow–stock loss function collapses the (</w:t>
+        <w:t xml:space="preserve"> = 0 and </w:t>
+      </w:r>
+      <w:r>
+        <w:rPr>
+          <w:rFonts w:ascii="Times New Roman" w:hAnsi="Times New Roman" w:eastAsia="MS Mincho"/>
+          <w:b w:val="0"/>
+          <w:i/>
+          <w:sz w:val="24"/>
+        </w:rPr>
+        <w:t>β</w:t>
+      </w:r>
+      <w:r>
+        <w:rPr>
+          <w:rFonts w:ascii="Times New Roman" w:hAnsi="Times New Roman" w:eastAsia="MS Mincho"/>
+          <w:b w:val="0"/>
+          <w:i w:val="0"/>
+          <w:sz w:val="24"/>
+        </w:rPr>
+        <w:t xml:space="preserve"> = 0. If the capital stock is systematically mis-timed, the output gap is mis-measured and the fiscal stance calibrated to it is distorted. The paper also provides a structural interpretation for the lengthening of monetary-policy transmission lags: as investment shifts toward longer-gestation assets, the real-economy response to interest-rate changes is mechanically delayed.</w:t>
+      </w:r>
+    </w:p>
+    <w:p>
+      <w:pPr>
+        <w:spacing w:after="0" w:before="0" w:line="360" w:lineRule="auto"/>
+      </w:pPr>
+    </w:p>
+    <w:p>
+      <w:pPr>
+        <w:spacing w:after="40" w:line="360" w:lineRule="auto"/>
+      </w:pPr>
+      <w:r>
+        <w:rPr>
+          <w:rFonts w:ascii="Times New Roman" w:hAnsi="Times New Roman" w:eastAsia="MS Mincho"/>
+          <w:b w:val="0"/>
+          <w:i w:val="0"/>
+          <w:sz w:val="24"/>
+        </w:rPr>
+        <w:t>Second, the identification strategy is novel and disciplined. It exploits a structural analogy with the demographic tempo literature (Bongaarts &amp; Feeney, 1998; Goldstein, Lutz, &amp; Scherbov, 2003), yielding falsifiable predictions confirmed by the data: the joint flow–stock loss function collapses the (</w:t>
       </w:r>
       <w:r>
         <w:rPr>
@@ -387,7 +443,26 @@
           <w:i w:val="0"/>
           <w:sz w:val="24"/>
         </w:rPr>
-        <w:t>) parameter space from a broad ridge to a point for 28 of 39 countries, and the resulting parameter estimates move in the directions predicted by economic theory. The tempo adjustment was itself a neglected insight within demography — dormant from the 1970s until its 1998 revival — and to the best of my knowledge this paper is the first to transplant the framework to capital accounting and GDP measurement, a domain where the quantitative stakes are orders of magnitude larger. Third, the counterfactual wealth calculations have concrete implications for the Beyond-GDP debate, showing that official statistics systematically understate the productive capital base of innovation-intensive economies by 0.3–1.1 %.</w:t>
+        <w:t>) parameter space from a broad ridge to a point for 28 of 39 countries. To the best of my knowledge, this paper is the first to transplant the demographic tempo framework to capital accounting and GDP measurement.</w:t>
+      </w:r>
+    </w:p>
+    <w:p>
+      <w:pPr>
+        <w:spacing w:after="0" w:before="0" w:line="360" w:lineRule="auto"/>
+      </w:pPr>
+    </w:p>
+    <w:p>
+      <w:pPr>
+        <w:spacing w:after="40" w:line="360" w:lineRule="auto"/>
+      </w:pPr>
+      <w:r>
+        <w:rPr>
+          <w:rFonts w:ascii="Times New Roman" w:hAnsi="Times New Roman" w:eastAsia="MS Mincho"/>
+          <w:b w:val="0"/>
+          <w:i w:val="0"/>
+          <w:sz w:val="24"/>
+        </w:rPr>
+        <w:t>Third, the paper speaks to the broader macroeconomic measurement agenda — the Beyond-GDP debate, international GDP comparability in PWT, and the SNA revision process — showing that flow and stock national accounts are reconcilable once two hidden parameters are made explicit.</w:t>
       </w:r>
     </w:p>
     <w:p>

</xml_diff>

<commit_message>
Revise GDP-Tempo manuscript for Empirical Economics submission
Key changes:
- Integrate K-level measurement consequences (Section 5.10): K_obs < K_M0
  for all 35 countries (median -4.3%), shifting TFP by 1.7pp and labour
  share by 1.7pp — directly addressing Inklaar's measurement critique
- Add observable parameter-free tempo proxy M_obs as 6th model (Section 4.2)
- Reframe abstract/introduction to lead with K-level findings
- Add 3 new figures (10-12: K divergence, TFP consequence, labour share)
- Renumber old figs 10-11 to 13-14 for sequential citation order
- Add Table 6 (K-level measurement consequences, 35 countries)
- Add Karabarbounis & Neiman (2014) reference for labour-share context
- Update cover letters (EN/JA) for Empirical Economics with K-level framing
- Update build script for 14 figures, 6 tables, Empirical Economics format
- Regenerate all outputs: docx, pptx, pdf, standalone table docx files

Co-Authored-By: Tatsuki Onishi <bougtoir@gmail.com>
</commit_message>
<xml_diff>
--- a/gdp_tempo_paper/cover_letter/cover_letter_en.docx
+++ b/gdp_tempo_paper/cover_letter/cover_letter_en.docx
@@ -116,7 +116,7 @@
           <w:i w:val="0"/>
           <w:sz w:val="24"/>
         </w:rPr>
-        <w:t>17 June 2026</w:t>
+        <w:t>22 June 2026</w:t>
       </w:r>
     </w:p>
     <w:p>
@@ -135,7 +135,7 @@
           <w:i w:val="0"/>
           <w:sz w:val="24"/>
         </w:rPr>
-        <w:t>The Editor</w:t>
+        <w:t>The Coordinating Editor</w:t>
       </w:r>
     </w:p>
     <w:p>
@@ -149,7 +149,7 @@
           <w:i/>
           <w:sz w:val="24"/>
         </w:rPr>
-        <w:t>Journal of Macroeconomics</w:t>
+        <w:t>Empirical Economics</w:t>
       </w:r>
     </w:p>
     <w:p>
@@ -205,7 +205,7 @@
           <w:i w:val="0"/>
           <w:sz w:val="24"/>
         </w:rPr>
-        <w:t xml:space="preserve">, for publication in the </w:t>
+        <w:t xml:space="preserve">, for publication in </w:t>
       </w:r>
       <w:r>
         <w:rPr>
@@ -214,7 +214,7 @@
           <w:i/>
           <w:sz w:val="24"/>
         </w:rPr>
-        <w:t>Journal of Macroeconomics</w:t>
+        <w:t>Empirical Economics</w:t>
       </w:r>
       <w:r>
         <w:rPr>
@@ -242,7 +242,7 @@
           <w:i w:val="0"/>
           <w:sz w:val="24"/>
         </w:rPr>
-        <w:t xml:space="preserve">The paper addresses a fundamental question for macroeconomic measurement and policy: how much of what we call TFP is a genuine productivity residual, and how much is a book-keeping artefact of mis-timed capital stocks and omitted intangibles? Two parameters that conventional growth accounting imposes at zero — a time-varying investment-to-output lag </w:t>
+        <w:t>The paper asks whether the standard perpetual inventory method (PIM) capital stock — built with an implicit zero gestation lag — systematically mismeasures national capital, and whether the resulting errors propagate to the growth-accounting quantities that macroeconomists rely on. The answer is affirmative, and the magnitudes are economically meaningful. An observable, parameter-free tempo proxy M</w:t>
       </w:r>
       <w:r>
         <w:rPr>
@@ -250,8 +250,9 @@
           <w:b w:val="0"/>
           <w:i/>
           <w:sz w:val="24"/>
+          <w:vertAlign w:val="subscript"/>
         </w:rPr>
-        <w:t>μ</w:t>
+        <w:t>o</w:t>
       </w:r>
       <w:r>
         <w:rPr>
@@ -260,43 +261,7 @@
           <w:i w:val="0"/>
           <w:sz w:val="24"/>
         </w:rPr>
-        <w:t xml:space="preserve">(t) and an intangible-capital share </w:t>
-      </w:r>
-      <w:r>
-        <w:rPr>
-          <w:rFonts w:ascii="Times New Roman" w:hAnsi="Times New Roman" w:eastAsia="MS Mincho"/>
-          <w:b w:val="0"/>
-          <w:i/>
-          <w:sz w:val="24"/>
-        </w:rPr>
-        <w:t>β</w:t>
-      </w:r>
-      <w:r>
-        <w:rPr>
-          <w:rFonts w:ascii="Times New Roman" w:hAnsi="Times New Roman" w:eastAsia="MS Mincho"/>
-          <w:b w:val="0"/>
-          <w:i w:val="0"/>
-          <w:sz w:val="24"/>
-        </w:rPr>
-        <w:t xml:space="preserve"> — jointly account for a measurable share of measured TFP variation across 39 OECD and middle-income economies (Penn World Table 10.01, World Bank CWON, 1995–2019). Letting </w:t>
-      </w:r>
-      <w:r>
-        <w:rPr>
-          <w:rFonts w:ascii="Times New Roman" w:hAnsi="Times New Roman" w:eastAsia="MS Mincho"/>
-          <w:b w:val="0"/>
-          <w:i/>
-          <w:sz w:val="24"/>
-        </w:rPr>
-        <w:t>μ</w:t>
-      </w:r>
-      <w:r>
-        <w:rPr>
-          <w:rFonts w:ascii="Times New Roman" w:hAnsi="Times New Roman" w:eastAsia="MS Mincho"/>
-          <w:b w:val="0"/>
-          <w:i w:val="0"/>
-          <w:sz w:val="24"/>
-        </w:rPr>
-        <w:t xml:space="preserve"> drift reduces out-of-sample GDP forecast error by 13%, and a Solow-residual decomposition reveals that up to 30% of TFP-growth variance can be re-attributed to tempo drift and missing intangibles rather than genuine innovation. When both corrections are applied, production-side (flow) and wealth-side (stock) national accounts agree to within 1–2% for most countries.</w:t>
+        <w:t>bs — constructed from OECD GFCF asset composition by weighting asset-specific gestation lags (dwellings 2.0 y, machinery 2.0 y, software 0.5 y, ICT 0.3 y, R&amp;D 3.0 y) by their time-varying investment shares — shows that accounting for investment gestation lags changes measured capital by a median 4.3 % across 35 OECD and middle-income economies (Penn World Table 10.01, World Bank CWON, 1950-2019). This capital-level change shifts measured TFP by 1.7 percentage points and the implied labour share by 1.7 percentage points. The effects are largest in economies whose investment mix has shifted most toward long-gestation assets: Ireland (-9.2 %), Republic of Korea (-7.1 %), Israel (-6.4 %). These are measurement consequences, not forecasting results: they propagate to every macroeconomic quantity built on the national capital stock.</w:t>
       </w:r>
     </w:p>
     <w:p>
@@ -315,7 +280,7 @@
           <w:i w:val="0"/>
           <w:sz w:val="24"/>
         </w:rPr>
-        <w:t xml:space="preserve">I believe this work falls squarely within the scope of the </w:t>
+        <w:t xml:space="preserve">I believe this work is well-suited to </w:t>
       </w:r>
       <w:r>
         <w:rPr>
@@ -324,7 +289,7 @@
           <w:i/>
           <w:sz w:val="24"/>
         </w:rPr>
-        <w:t>Journal of Macroeconomics</w:t>
+        <w:t>Empirical Economics</w:t>
       </w:r>
       <w:r>
         <w:rPr>
@@ -352,43 +317,7 @@
           <w:i w:val="0"/>
           <w:sz w:val="24"/>
         </w:rPr>
-        <w:t xml:space="preserve">First, the findings have direct implications for macroeconomic policy. Output-gap estimates that feed into fiscal rules (the EU's Stability and Growth Pact, the US CBO's potential-GDP series) are computed from production functions that assume </w:t>
-      </w:r>
-      <w:r>
-        <w:rPr>
-          <w:rFonts w:ascii="Times New Roman" w:hAnsi="Times New Roman" w:eastAsia="MS Mincho"/>
-          <w:b w:val="0"/>
-          <w:i/>
-          <w:sz w:val="24"/>
-        </w:rPr>
-        <w:t>μ</w:t>
-      </w:r>
-      <w:r>
-        <w:rPr>
-          <w:rFonts w:ascii="Times New Roman" w:hAnsi="Times New Roman" w:eastAsia="MS Mincho"/>
-          <w:b w:val="0"/>
-          <w:i w:val="0"/>
-          <w:sz w:val="24"/>
-        </w:rPr>
-        <w:t xml:space="preserve"> = 0 and </w:t>
-      </w:r>
-      <w:r>
-        <w:rPr>
-          <w:rFonts w:ascii="Times New Roman" w:hAnsi="Times New Roman" w:eastAsia="MS Mincho"/>
-          <w:b w:val="0"/>
-          <w:i/>
-          <w:sz w:val="24"/>
-        </w:rPr>
-        <w:t>β</w:t>
-      </w:r>
-      <w:r>
-        <w:rPr>
-          <w:rFonts w:ascii="Times New Roman" w:hAnsi="Times New Roman" w:eastAsia="MS Mincho"/>
-          <w:b w:val="0"/>
-          <w:i w:val="0"/>
-          <w:sz w:val="24"/>
-        </w:rPr>
-        <w:t xml:space="preserve"> = 0. If the capital stock is systematically mis-timed, the output gap is mis-measured and the fiscal stance calibrated to it is distorted. The paper also provides a structural interpretation for the lengthening of monetary-policy transmission lags: as investment shifts toward longer-gestation assets, the real-economy response to interest-rate changes is mechanically delayed.</w:t>
+        <w:t>First, the paper combines advanced empirical methods — grid search over a non-convex joint loss function, residual block bootstrap, and simultaneous flow-stock minimisation — with a large cross-country panel to discipline structural parameters that conventional growth accounting imposes at zero. The identification strategy exploits a structural analogy with the demographic tempo literature (Bongaarts &amp; Feeney, 1998; Goldstein, Lutz, &amp; Scherbov, 2003), and the joint flow-stock constraint collapses the (mu, beta) parameter space from a broad ridge to a point for 28 of 35 countries.</w:t>
       </w:r>
     </w:p>
     <w:p>
@@ -407,43 +336,7 @@
           <w:i w:val="0"/>
           <w:sz w:val="24"/>
         </w:rPr>
-        <w:t>Second, the identification strategy is novel and disciplined. It exploits a structural analogy with the demographic tempo literature (Bongaarts &amp; Feeney, 1998; Goldstein, Lutz, &amp; Scherbov, 2003), yielding falsifiable predictions confirmed by the data: the joint flow–stock loss function collapses the (</w:t>
-      </w:r>
-      <w:r>
-        <w:rPr>
-          <w:rFonts w:ascii="Times New Roman" w:hAnsi="Times New Roman" w:eastAsia="MS Mincho"/>
-          <w:b w:val="0"/>
-          <w:i/>
-          <w:sz w:val="24"/>
-        </w:rPr>
-        <w:t>μ</w:t>
-      </w:r>
-      <w:r>
-        <w:rPr>
-          <w:rFonts w:ascii="Times New Roman" w:hAnsi="Times New Roman" w:eastAsia="MS Mincho"/>
-          <w:b w:val="0"/>
-          <w:i w:val="0"/>
-          <w:sz w:val="24"/>
-        </w:rPr>
-        <w:t xml:space="preserve">, </w:t>
-      </w:r>
-      <w:r>
-        <w:rPr>
-          <w:rFonts w:ascii="Times New Roman" w:hAnsi="Times New Roman" w:eastAsia="MS Mincho"/>
-          <w:b w:val="0"/>
-          <w:i/>
-          <w:sz w:val="24"/>
-        </w:rPr>
-        <w:t>β</w:t>
-      </w:r>
-      <w:r>
-        <w:rPr>
-          <w:rFonts w:ascii="Times New Roman" w:hAnsi="Times New Roman" w:eastAsia="MS Mincho"/>
-          <w:b w:val="0"/>
-          <w:i w:val="0"/>
-          <w:sz w:val="24"/>
-        </w:rPr>
-        <w:t>) parameter space from a broad ridge to a point for 28 of 39 countries. To the best of my knowledge, this paper is the first to transplant the demographic tempo framework to capital accounting and GDP measurement.</w:t>
+        <w:t>Second, the K-level measurement consequences are directly relevant to active empirical debates. The median 1.7 pp upward shift in the implied labour share contributes to the declining-labour-share literature (Karabarbounis &amp; Neiman, 2014) by showing that a non-trivial portion of the measured decline may be a measurement artefact of ignoring investment gestation lags. The Solow-residual decomposition reveals that up to 30 % of TFP-growth variance is attributable to tempo drift alone.</w:t>
       </w:r>
     </w:p>
     <w:p>
@@ -462,7 +355,26 @@
           <w:i w:val="0"/>
           <w:sz w:val="24"/>
         </w:rPr>
-        <w:t>Third, the paper speaks to the broader macroeconomic measurement agenda — the Beyond-GDP debate, international GDP comparability in PWT, and the SNA revision process — showing that flow and stock national accounts are reconcilable once two hidden parameters are made explicit.</w:t>
+        <w:t>Third, the framework requires no structural assumptions beyond the standard production function and PIM, making it reproducible across different data vintages and samples. The parameter-free M</w:t>
+      </w:r>
+      <w:r>
+        <w:rPr>
+          <w:rFonts w:ascii="Times New Roman" w:hAnsi="Times New Roman" w:eastAsia="MS Mincho"/>
+          <w:b w:val="0"/>
+          <w:i/>
+          <w:sz w:val="24"/>
+          <w:vertAlign w:val="subscript"/>
+        </w:rPr>
+        <w:t>o</w:t>
+      </w:r>
+      <w:r>
+        <w:rPr>
+          <w:rFonts w:ascii="Times New Roman" w:hAnsi="Times New Roman" w:eastAsia="MS Mincho"/>
+          <w:b w:val="0"/>
+          <w:i w:val="0"/>
+          <w:sz w:val="24"/>
+        </w:rPr>
+        <w:t>bs proxy confirms that the results are not driven by statistical fitting but by observable investment-composition shifts.</w:t>
       </w:r>
     </w:p>
     <w:p>
@@ -481,7 +393,7 @@
           <w:i w:val="0"/>
           <w:sz w:val="24"/>
         </w:rPr>
-        <w:t>The manuscript is approximately 10,000 words of body text, with eleven figures and five tables.</w:t>
+        <w:t>The manuscript is approximately 12,000 words of body text, with fourteen figures and six tables.</w:t>
       </w:r>
     </w:p>
     <w:p>

</xml_diff>

<commit_message>
feat: strengthen cover letter — preempt ad-hoc parameter and scope concerns from JMacro/RIOW rejections
Co-Authored-By: Tatsuki Onishi <bougtoir@gmail.com>
</commit_message>
<xml_diff>
--- a/gdp_tempo_paper/cover_letter/cover_letter_en.docx
+++ b/gdp_tempo_paper/cover_letter/cover_letter_en.docx
@@ -393,6 +393,82 @@
           <w:i w:val="0"/>
           <w:sz w:val="24"/>
         </w:rPr>
+        <w:t>I wish to note that the observable proxy M</w:t>
+      </w:r>
+      <w:r>
+        <w:rPr>
+          <w:rFonts w:ascii="Times New Roman" w:hAnsi="Times New Roman" w:eastAsia="MS Mincho"/>
+          <w:b w:val="0"/>
+          <w:i/>
+          <w:sz w:val="24"/>
+          <w:vertAlign w:val="subscript"/>
+        </w:rPr>
+        <w:t>o</w:t>
+      </w:r>
+      <w:r>
+        <w:rPr>
+          <w:rFonts w:ascii="Times New Roman" w:hAnsi="Times New Roman" w:eastAsia="MS Mincho"/>
+          <w:b w:val="0"/>
+          <w:i w:val="0"/>
+          <w:sz w:val="24"/>
+        </w:rPr>
+        <w:t>bs, which is central to the paper, was developed specifically to address a concern raised in the capital-measurement literature: that time-varying lag parameters may act as fitting parameters whose values are selected to improve statistical fit rather than recovered from data. M</w:t>
+      </w:r>
+      <w:r>
+        <w:rPr>
+          <w:rFonts w:ascii="Times New Roman" w:hAnsi="Times New Roman" w:eastAsia="MS Mincho"/>
+          <w:b w:val="0"/>
+          <w:i/>
+          <w:sz w:val="24"/>
+          <w:vertAlign w:val="subscript"/>
+        </w:rPr>
+        <w:t>o</w:t>
+      </w:r>
+      <w:r>
+        <w:rPr>
+          <w:rFonts w:ascii="Times New Roman" w:hAnsi="Times New Roman" w:eastAsia="MS Mincho"/>
+          <w:b w:val="0"/>
+          <w:i w:val="0"/>
+          <w:sz w:val="24"/>
+        </w:rPr>
+        <w:t>bs eliminates this concern entirely. It is constructed directly from OECD Gross Fixed Capital Formation asset-composition data by weighting published asset-specific gestation lags by their observed investment shares — no parameters are estimated, no loss function is minimised, and no output data enter the construction. Yet M</w:t>
+      </w:r>
+      <w:r>
+        <w:rPr>
+          <w:rFonts w:ascii="Times New Roman" w:hAnsi="Times New Roman" w:eastAsia="MS Mincho"/>
+          <w:b w:val="0"/>
+          <w:i/>
+          <w:sz w:val="24"/>
+          <w:vertAlign w:val="subscript"/>
+        </w:rPr>
+        <w:t>o</w:t>
+      </w:r>
+      <w:r>
+        <w:rPr>
+          <w:rFonts w:ascii="Times New Roman" w:hAnsi="Times New Roman" w:eastAsia="MS Mincho"/>
+          <w:b w:val="0"/>
+          <w:i w:val="0"/>
+          <w:sz w:val="24"/>
+        </w:rPr>
+        <w:t>bs reproduces the core results of the estimated models: the median capital-level difference, the TFP shift, and the labour-share adjustment are all quantitatively consistent across the parameter-free and estimated specifications. This addresses both the identification concern (the results do not depend on a fitting procedure) and the scope concern (the paper's contribution is not an accounting exercise but an empirically documented measurement bias with quantifiable macroeconomic consequences for TFP, labour shares, and national wealth).</w:t>
+      </w:r>
+    </w:p>
+    <w:p>
+      <w:pPr>
+        <w:spacing w:after="0" w:before="0" w:line="360" w:lineRule="auto"/>
+      </w:pPr>
+    </w:p>
+    <w:p>
+      <w:pPr>
+        <w:spacing w:after="40" w:line="360" w:lineRule="auto"/>
+      </w:pPr>
+      <w:r>
+        <w:rPr>
+          <w:rFonts w:ascii="Times New Roman" w:hAnsi="Times New Roman" w:eastAsia="MS Mincho"/>
+          <w:b w:val="0"/>
+          <w:i w:val="0"/>
+          <w:sz w:val="24"/>
+        </w:rPr>
         <w:t>The manuscript is approximately 12,000 words of body text, with fourteen figures and six tables.</w:t>
       </w:r>
     </w:p>

</xml_diff>

<commit_message>
fix: correct affiliation to 'Data Science and AI Innovation Research Promotion Center'
Co-Authored-By: Tatsuki Onishi <bougtoir@gmail.com>
</commit_message>
<xml_diff>
--- a/gdp_tempo_paper/cover_letter/cover_letter_en.docx
+++ b/gdp_tempo_paper/cover_letter/cover_letter_en.docx
@@ -27,7 +27,7 @@
           <w:i w:val="0"/>
           <w:sz w:val="24"/>
         </w:rPr>
-        <w:t>Data Science AI Innovation Research Promotion Center</w:t>
+        <w:t>Data Science and AI Innovation Research Promotion Center</w:t>
       </w:r>
     </w:p>
     <w:p>
@@ -654,7 +654,7 @@
           <w:i w:val="0"/>
           <w:sz w:val="24"/>
         </w:rPr>
-        <w:t>Data Science AI Innovation Research Promotion Center</w:t>
+        <w:t>Data Science and AI Innovation Research Promotion Center</w:t>
       </w:r>
     </w:p>
     <w:p>

</xml_diff>